<commit_message>
Correct a contradiction: section 4.3 still said the RMT driver was not written
Revision 3.4 recorded the DShot protocol landing and said the RMT driver was
deliberately not written. Revisions 3.6 and 3.7 then wrote it and wired it in, and
added 4.3.1 describing it -- but the earlier paragraph stayed as it was.

So the specification said, four paragraphs apart, both that the driver did not
exist and that it did. The second is true; the first was true when written.

Corrected to say what is actually the case: the arithmetic is host-tested, the
peripheral calls have never been compiled, 4.3.1 separates the two, and nothing
here has driven a motor.

Found while auditing what is still open, which is the only reason it surfaced --
no check compares a claim in one section against a claim in another, and it is
not obvious that one could.

Co-Authored-By: Claude Opus 5 <noreply@anthropic.com>
</commit_message>
<xml_diff>
--- a/docs/Odyssey-10-Pro-Drone-System.docx
+++ b/docs/Odyssey-10-Pro-Drone-System.docx
@@ -11197,10 +11197,16 @@
         <w:rPr>
           <w:b/>
         </w:rPr>
-        <w:t>The RMT driver is deliberately NOT written.</w:t>
-      </w:r>
-      <w:r>
-        <w:t xml:space="preserve"> Putting those frames on a wire means driving the ESP32-P4's RMT peripheral to a fraction of a microsecond and turning the line around fast enough to catch the ESC's reply. That code cannot be compiled in this environment, let alone verified, and it drives motors — a frame that misses a bit boundary does not fail politely, it becomes a throttle value the ESC acts on. Writing it untested would produce the appearance of a finished feature and none of the substance. What it needs is spelled out in §4.3.1.</w:t>
+        <w:t>Revision 3.6 added the RMT driver, and 3.7 wired it into the flight loop.</w:t>
+      </w:r>
+      <w:r>
+        <w:t xml:space="preserve"> Its timing arithmetic and symbol encoding are host-tested; the ESP-IDF peripheral calls have never been compiled, because there is no IDF in the environment they were written in. §4.3.1 splits the two apart, lists the four assumptions the hardware has to confirm, and gives the bring-up order. </w:t>
+      </w:r>
+      <w:r>
+        <w:rPr>
+          <w:b/>
+        </w:rPr>
+        <w:t>Nothing here has driven a motor.</w:t>
       </w:r>
     </w:p>
     <w:p>
@@ -11221,7 +11227,17 @@
         <w:t>0</w:t>
       </w:r>
       <w:r>
-        <w:t>, and analog PWM remains the default output.</w:t>
+        <w:t xml:space="preserve">, and analog PWM remains the default output. The </w:t>
+      </w:r>
+      <w:r>
+        <w:rPr>
+          <w:rFonts w:ascii="Consolas" w:hAnsi="Consolas"/>
+          <w:sz w:val="19"/>
+        </w:rPr>
+        <w:t>unverified-defaults</w:t>
+      </w:r>
+      <w:r>
+        <w:t xml:space="preserve"> check keeps it that way, so enabling it is a deliberate, reviewable change rather than a line left over from debugging.</w:t>
       </w:r>
     </w:p>
     <w:p>

</xml_diff>